<commit_message>
docs: Actualización de escaleta de Primaria y lista de placas
</commit_message>
<xml_diff>
--- a/LISTA DE PLACAS.docx
+++ b/LISTA DE PLACAS.docx
@@ -794,7 +794,7 @@
               <w:rPr>
                 <w:lang w:val="es-ES"/>
               </w:rPr>
-              <w:t>Moto</w:t>
+              <w:t>Camioneta</w:t>
             </w:r>
           </w:p>
         </w:tc>
@@ -813,7 +813,7 @@
               <w:rPr>
                 <w:lang w:val="es-ES"/>
               </w:rPr>
-              <w:t>LDX70F</w:t>
+              <w:t>KZY518</w:t>
             </w:r>
           </w:p>
         </w:tc>

</xml_diff>